<commit_message>
Commit assign Flask and mongodb 3.docx
</commit_message>
<xml_diff>
--- a/Flask and mongodb 3.docx
+++ b/Flask and mongodb 3.docx
@@ -4,15 +4,13 @@
   <w:body>
     <w:p>
       <w:pPr>
+        <w:pStyle w:val="ListParagraph"/>
+        <w:numPr>
+          <w:ilvl w:val="0"/>
+          <w:numId w:val="1"/>
+        </w:numPr>
         <w:spacing w:before="240" w:line="360" w:lineRule="auto"/>
       </w:pPr>
-      <w:r>
-        <w:rPr>
-          <w:sz w:val="24"/>
-          <w:szCs w:val="24"/>
-        </w:rPr>
-        <w:t xml:space="preserve">1. </w:t>
-      </w:r>
       <w:r>
         <w:t xml:space="preserve">Create a Flask application with an </w:t>
       </w:r>
@@ -40,6 +38,13 @@
       <w:pPr>
         <w:spacing w:before="240" w:line="360" w:lineRule="auto"/>
       </w:pPr>
+      <w:bookmarkStart w:id="0" w:name="_GoBack"/>
+      <w:bookmarkEnd w:id="0"/>
+    </w:p>
+    <w:p>
+      <w:pPr>
+        <w:spacing w:before="240" w:line="360" w:lineRule="auto"/>
+      </w:pPr>
       <w:r>
         <w:rPr>
           <w:noProof/>
@@ -60,7 +65,7 @@
                     <pic:cNvPicPr/>
                   </pic:nvPicPr>
                   <pic:blipFill>
-                    <a:blip r:embed="rId4"/>
+                    <a:blip r:embed="rId5"/>
                     <a:stretch>
                       <a:fillRect/>
                     </a:stretch>
@@ -96,13 +101,7 @@
         <w:spacing w:before="240" w:line="360" w:lineRule="auto"/>
       </w:pPr>
       <w:r>
-        <w:t>2</w:t>
-      </w:r>
-      <w:r>
-        <w:t>. Create a form on the frontend that, when submitted, inserts data into MongoDB Atlas. Upon successful su</w:t>
-      </w:r>
-      <w:r>
-        <w:t xml:space="preserve">bmission, the user should be redirected to another page displaying the message </w:t>
+        <w:t xml:space="preserve">2. Create a form on the frontend that, when submitted, inserts data into MongoDB Atlas. Upon successful submission, the user should be redirected to another page displaying the message </w:t>
       </w:r>
       <w:r>
         <w:rPr>
@@ -118,9 +117,101 @@
     <w:p/>
     <w:p/>
     <w:p>
-      <w:bookmarkStart w:id="0" w:name="_GoBack"/>
-      <w:bookmarkEnd w:id="0"/>
+      <w:r>
+        <w:t xml:space="preserve">Project </w:t>
+      </w:r>
+      <w:proofErr w:type="gramStart"/>
+      <w:r>
+        <w:t>URL :</w:t>
+      </w:r>
+      <w:proofErr w:type="gramEnd"/>
     </w:p>
+    <w:p/>
+    <w:p>
+      <w:hyperlink r:id="rId6" w:history="1">
+        <w:proofErr w:type="spellStart"/>
+        <w:r>
+          <w:rPr>
+            <w:rStyle w:val="Hyperlink"/>
+          </w:rPr>
+          <w:t>AMD_docs</w:t>
+        </w:r>
+        <w:proofErr w:type="spellEnd"/>
+        <w:r>
+          <w:rPr>
+            <w:rStyle w:val="Hyperlink"/>
+          </w:rPr>
+          <w:t>/</w:t>
+        </w:r>
+        <w:proofErr w:type="spellStart"/>
+        <w:r>
+          <w:rPr>
+            <w:rStyle w:val="Hyperlink"/>
+          </w:rPr>
+          <w:t>mongo_proj</w:t>
+        </w:r>
+        <w:proofErr w:type="spellEnd"/>
+        <w:r>
+          <w:rPr>
+            <w:rStyle w:val="Hyperlink"/>
+          </w:rPr>
+          <w:t xml:space="preserve"> at main · deoreamol54-ghub/</w:t>
+        </w:r>
+        <w:proofErr w:type="spellStart"/>
+        <w:r>
+          <w:rPr>
+            <w:rStyle w:val="Hyperlink"/>
+          </w:rPr>
+          <w:t>AMD_docs</w:t>
+        </w:r>
+        <w:proofErr w:type="spellEnd"/>
+      </w:hyperlink>
+    </w:p>
+    <w:p/>
+    <w:p>
+      <w:r>
+        <w:rPr>
+          <w:noProof/>
+        </w:rPr>
+        <w:lastRenderedPageBreak/>
+        <w:drawing>
+          <wp:inline distT="0" distB="0" distL="0" distR="0" wp14:anchorId="44D21EBC" wp14:editId="54CFECFC">
+            <wp:extent cx="5943600" cy="2686685"/>
+            <wp:effectExtent l="0" t="0" r="0" b="0"/>
+            <wp:docPr id="2" name="Picture 2"/>
+            <wp:cNvGraphicFramePr>
+              <a:graphicFrameLocks xmlns:a="http://schemas.openxmlformats.org/drawingml/2006/main" noChangeAspect="1"/>
+            </wp:cNvGraphicFramePr>
+            <a:graphic xmlns:a="http://schemas.openxmlformats.org/drawingml/2006/main">
+              <a:graphicData uri="http://schemas.openxmlformats.org/drawingml/2006/picture">
+                <pic:pic xmlns:pic="http://schemas.openxmlformats.org/drawingml/2006/picture">
+                  <pic:nvPicPr>
+                    <pic:cNvPr id="1" name=""/>
+                    <pic:cNvPicPr/>
+                  </pic:nvPicPr>
+                  <pic:blipFill>
+                    <a:blip r:embed="rId7"/>
+                    <a:stretch>
+                      <a:fillRect/>
+                    </a:stretch>
+                  </pic:blipFill>
+                  <pic:spPr>
+                    <a:xfrm>
+                      <a:off x="0" y="0"/>
+                      <a:ext cx="5943600" cy="2686685"/>
+                    </a:xfrm>
+                    <a:prstGeom prst="rect">
+                      <a:avLst/>
+                    </a:prstGeom>
+                  </pic:spPr>
+                </pic:pic>
+              </a:graphicData>
+            </a:graphic>
+          </wp:inline>
+        </w:drawing>
+      </w:r>
+    </w:p>
+    <w:p/>
     <w:sectPr>
       <w:pgSz w:w="12240" w:h="15840"/>
       <w:pgMar w:top="1440" w:right="1440" w:bottom="1440" w:left="1440" w:header="720" w:footer="720" w:gutter="0"/>
@@ -129,6 +220,104 @@
     </w:sectPr>
   </w:body>
 </w:document>
+</file>
+
+<file path=word/numbering.xml><?xml version="1.0" encoding="utf-8"?>
+<w:numbering xmlns:wpc="http://schemas.microsoft.com/office/word/2010/wordprocessingCanvas" xmlns:cx="http://schemas.microsoft.com/office/drawing/2014/chartex" xmlns:cx1="http://schemas.microsoft.com/office/drawing/2015/9/8/chartex" xmlns:cx2="http://schemas.microsoft.com/office/drawing/2015/10/21/chartex" xmlns:cx3="http://schemas.microsoft.com/office/drawing/2016/5/9/chartex" xmlns:cx4="http://schemas.microsoft.com/office/drawing/2016/5/10/chartex" xmlns:cx5="http://schemas.microsoft.com/office/drawing/2016/5/11/chartex" xmlns:cx6="http://schemas.microsoft.com/office/drawing/2016/5/12/chartex" xmlns:cx7="http://schemas.microsoft.com/office/drawing/2016/5/13/chartex" xmlns:cx8="http://schemas.microsoft.com/office/drawing/2016/5/14/chartex" xmlns:mc="http://schemas.openxmlformats.org/markup-compatibility/2006" xmlns:aink="http://schemas.microsoft.com/office/drawing/2016/ink" xmlns:am3d="http://schemas.microsoft.com/office/drawing/2017/model3d" xmlns:o="urn:schemas-microsoft-com:office:office" xmlns:r="http://schemas.openxmlformats.org/officeDocument/2006/relationships" xmlns:m="http://schemas.openxmlformats.org/officeDocument/2006/math" xmlns:v="urn:schemas-microsoft-com:vml" xmlns:wp14="http://schemas.microsoft.com/office/word/2010/wordprocessingDrawing" xmlns:wp="http://schemas.openxmlformats.org/drawingml/2006/wordprocessingDrawing" xmlns:w10="urn:schemas-microsoft-com:office:word" xmlns:w="http://schemas.openxmlformats.org/wordprocessingml/2006/main" xmlns:w14="http://schemas.microsoft.com/office/word/2010/wordml" xmlns:w15="http://schemas.microsoft.com/office/word/2012/wordml" xmlns:w16cid="http://schemas.microsoft.com/office/word/2016/wordml/cid" xmlns:w16se="http://schemas.microsoft.com/office/word/2015/wordml/symex" xmlns:wpg="http://schemas.microsoft.com/office/word/2010/wordprocessingGroup" xmlns:wpi="http://schemas.microsoft.com/office/word/2010/wordprocessingInk" xmlns:wne="http://schemas.microsoft.com/office/word/2006/wordml" xmlns:wps="http://schemas.microsoft.com/office/word/2010/wordprocessingShape" mc:Ignorable="w14 w15 w16se w16cid wp14">
+  <w:abstractNum w:abstractNumId="0" w15:restartNumberingAfterBreak="0">
+    <w:nsid w:val="24D065E4"/>
+    <w:multiLevelType w:val="hybridMultilevel"/>
+    <w:tmpl w:val="97E6DF0A"/>
+    <w:lvl w:ilvl="0" w:tplc="EF24E666">
+      <w:start w:val="1"/>
+      <w:numFmt w:val="decimal"/>
+      <w:lvlText w:val="%1."/>
+      <w:lvlJc w:val="left"/>
+      <w:pPr>
+        <w:ind w:left="720" w:hanging="360"/>
+      </w:pPr>
+      <w:rPr>
+        <w:rFonts w:hint="default"/>
+        <w:sz w:val="24"/>
+      </w:rPr>
+    </w:lvl>
+    <w:lvl w:ilvl="1" w:tplc="40090019" w:tentative="1">
+      <w:start w:val="1"/>
+      <w:numFmt w:val="lowerLetter"/>
+      <w:lvlText w:val="%2."/>
+      <w:lvlJc w:val="left"/>
+      <w:pPr>
+        <w:ind w:left="1440" w:hanging="360"/>
+      </w:pPr>
+    </w:lvl>
+    <w:lvl w:ilvl="2" w:tplc="4009001B" w:tentative="1">
+      <w:start w:val="1"/>
+      <w:numFmt w:val="lowerRoman"/>
+      <w:lvlText w:val="%3."/>
+      <w:lvlJc w:val="right"/>
+      <w:pPr>
+        <w:ind w:left="2160" w:hanging="180"/>
+      </w:pPr>
+    </w:lvl>
+    <w:lvl w:ilvl="3" w:tplc="4009000F" w:tentative="1">
+      <w:start w:val="1"/>
+      <w:numFmt w:val="decimal"/>
+      <w:lvlText w:val="%4."/>
+      <w:lvlJc w:val="left"/>
+      <w:pPr>
+        <w:ind w:left="2880" w:hanging="360"/>
+      </w:pPr>
+    </w:lvl>
+    <w:lvl w:ilvl="4" w:tplc="40090019" w:tentative="1">
+      <w:start w:val="1"/>
+      <w:numFmt w:val="lowerLetter"/>
+      <w:lvlText w:val="%5."/>
+      <w:lvlJc w:val="left"/>
+      <w:pPr>
+        <w:ind w:left="3600" w:hanging="360"/>
+      </w:pPr>
+    </w:lvl>
+    <w:lvl w:ilvl="5" w:tplc="4009001B" w:tentative="1">
+      <w:start w:val="1"/>
+      <w:numFmt w:val="lowerRoman"/>
+      <w:lvlText w:val="%6."/>
+      <w:lvlJc w:val="right"/>
+      <w:pPr>
+        <w:ind w:left="4320" w:hanging="180"/>
+      </w:pPr>
+    </w:lvl>
+    <w:lvl w:ilvl="6" w:tplc="4009000F" w:tentative="1">
+      <w:start w:val="1"/>
+      <w:numFmt w:val="decimal"/>
+      <w:lvlText w:val="%7."/>
+      <w:lvlJc w:val="left"/>
+      <w:pPr>
+        <w:ind w:left="5040" w:hanging="360"/>
+      </w:pPr>
+    </w:lvl>
+    <w:lvl w:ilvl="7" w:tplc="40090019" w:tentative="1">
+      <w:start w:val="1"/>
+      <w:numFmt w:val="lowerLetter"/>
+      <w:lvlText w:val="%8."/>
+      <w:lvlJc w:val="left"/>
+      <w:pPr>
+        <w:ind w:left="5760" w:hanging="360"/>
+      </w:pPr>
+    </w:lvl>
+    <w:lvl w:ilvl="8" w:tplc="4009001B" w:tentative="1">
+      <w:start w:val="1"/>
+      <w:numFmt w:val="lowerRoman"/>
+      <w:lvlText w:val="%9."/>
+      <w:lvlJc w:val="right"/>
+      <w:pPr>
+        <w:ind w:left="6480" w:hanging="180"/>
+      </w:pPr>
+    </w:lvl>
+  </w:abstractNum>
+  <w:num w:numId="1">
+    <w:abstractNumId w:val="0"/>
+  </w:num>
+</w:numbering>
 </file>
 
 <file path=word/styles.xml><?xml version="1.0" encoding="utf-8"?>
@@ -755,6 +944,18 @@
       <w:szCs w:val="18"/>
     </w:rPr>
   </w:style>
+  <w:style w:type="character" w:styleId="Hyperlink">
+    <w:name w:val="Hyperlink"/>
+    <w:basedOn w:val="DefaultParagraphFont"/>
+    <w:uiPriority w:val="99"/>
+    <w:semiHidden/>
+    <w:unhideWhenUsed/>
+    <w:rsid w:val="00A61D7A"/>
+    <w:rPr>
+      <w:color w:val="0000FF"/>
+      <w:u w:val="single"/>
+    </w:rPr>
+  </w:style>
 </w:styles>
 </file>
 

</xml_diff>